<commit_message>
Report updated with Behavioiral Segmentation
</commit_message>
<xml_diff>
--- a/2nd DEV DM_MAA_Report.docx
+++ b/2nd DEV DM_MAA_Report.docx
@@ -621,10 +621,14 @@
       </w:pPr>
       <w:r>
         <w:rPr>
-          <w:rFonts w:ascii="Calibri" w:cs="Calibri" w:eastAsia="Calibri" w:hAnsi="Calibri"/>
-          <w:rtl w:val="0"/>
-        </w:rPr>
-        <w:t xml:space="preserve">Title of Report</w:t>
+          <w:rtl w:val="0"/>
+        </w:rPr>
+        <w:t xml:space="preserve">Amazing International Airlines Inc.</w:t>
+      </w:r>
+      <w:r>
+        <w:rPr>
+          <w:rtl w:val="0"/>
+        </w:rPr>
       </w:r>
     </w:p>
     <w:p>
@@ -1063,7 +1067,7 @@
           <w:szCs w:val="32"/>
           <w:rtl w:val="0"/>
         </w:rPr>
-        <w:t xml:space="preserve">Group 99</w:t>
+        <w:t xml:space="preserve">Group 25</w:t>
       </w:r>
       <w:r>
         <w:rPr>
@@ -1103,7 +1107,7 @@
         <w:rPr>
           <w:rtl w:val="0"/>
         </w:rPr>
-        <w:t xml:space="preserve">Student2 Name, 20002222</w:t>
+        <w:t xml:space="preserve">Muhammad Ammar, 20250440</w:t>
       </w:r>
     </w:p>
     <w:p>
@@ -1225,7 +1229,43 @@
           <w:vertAlign w:val="baseline"/>
           <w:rtl w:val="0"/>
         </w:rPr>
-        <w:t xml:space="preserve">Fall/Spring Semester 2024-2025</w:t>
+        <w:t xml:space="preserve">Fall/Spring Semester 202</w:t>
+      </w:r>
+      <w:r>
+        <w:rPr>
+          <w:rtl w:val="0"/>
+        </w:rPr>
+        <w:t xml:space="preserve">5</w:t>
+      </w:r>
+      <w:r>
+        <w:rPr>
+          <w:rFonts w:ascii="Calibri" w:cs="Calibri" w:eastAsia="Calibri" w:hAnsi="Calibri"/>
+          <w:b w:val="0"/>
+          <w:bCs w:val="0"/>
+          <w:i w:val="0"/>
+          <w:iCs w:val="0"/>
+          <w:smallCaps w:val="0"/>
+          <w:strike w:val="0"/>
+          <w:color w:val="000000"/>
+          <w:sz w:val="22"/>
+          <w:szCs w:val="22"/>
+          <w:u w:val="none"/>
+          <w:shd w:fill="auto" w:val="clear"/>
+          <w:vertAlign w:val="baseline"/>
+          <w:rtl w:val="0"/>
+        </w:rPr>
+        <w:t xml:space="preserve">-202</w:t>
+      </w:r>
+      <w:r>
+        <w:rPr>
+          <w:rtl w:val="0"/>
+        </w:rPr>
+        <w:t xml:space="preserve">6</w:t>
+      </w:r>
+      <w:r>
+        <w:rPr>
+          <w:rtl w:val="0"/>
+        </w:rPr>
       </w:r>
     </w:p>
     <w:p>
@@ -1400,7 +1440,7 @@
     </w:p>
     <w:sdt>
       <w:sdtPr>
-        <w:id w:val="1000446905"/>
+        <w:id w:val="1094570582"/>
         <w:docPartObj>
           <w:docPartGallery w:val="Table of Contents"/>
           <w:docPartUnique w:val="1"/>
@@ -1449,7 +1489,7 @@
             <w:instrText xml:space="preserve"> TOC \h \u \z \t "Heading 1,1,Heading 2,2,Heading 3,3,Heading 4,4,Heading 5,1,"</w:instrText>
             <w:fldChar w:fldCharType="separate"/>
           </w:r>
-          <w:hyperlink w:anchor="_wv60qhocxjuv">
+          <w:hyperlink w:anchor="_ge9i7ovi3rvx">
             <w:r>
               <w:rPr>
                 <w:rFonts w:ascii="Calibri" w:cs="Calibri" w:eastAsia="Calibri" w:hAnsi="Calibri"/>
@@ -1470,7 +1510,7 @@
               <w:t xml:space="preserve">1.</w:t>
             </w:r>
           </w:hyperlink>
-          <w:hyperlink w:anchor="_wv60qhocxjuv">
+          <w:hyperlink w:anchor="_ge9i7ovi3rvx">
             <w:r>
               <w:rPr>
                 <w:rFonts w:ascii="Calibri" w:cs="Calibri" w:eastAsia="Calibri" w:hAnsi="Calibri"/>
@@ -1493,7 +1533,7 @@
           </w:hyperlink>
           <w:r>
             <w:fldChar w:fldCharType="begin"/>
-            <w:instrText xml:space="preserve"> PAGEREF _wv60qhocxjuv \h </w:instrText>
+            <w:instrText xml:space="preserve"> PAGEREF _ge9i7ovi3rvx \h </w:instrText>
             <w:fldChar w:fldCharType="separate"/>
           </w:r>
           <w:r>
@@ -1563,7 +1603,7 @@
               <w:vertAlign w:val="baseline"/>
             </w:rPr>
           </w:pPr>
-          <w:hyperlink w:anchor="_vt7hnet41m9p">
+          <w:hyperlink w:anchor="_qq9jp6q027dj">
             <w:r>
               <w:rPr>
                 <w:rFonts w:ascii="Calibri" w:cs="Calibri" w:eastAsia="Calibri" w:hAnsi="Calibri"/>
@@ -1584,7 +1624,7 @@
               <w:t xml:space="preserve">2.</w:t>
             </w:r>
           </w:hyperlink>
-          <w:hyperlink w:anchor="_vt7hnet41m9p">
+          <w:hyperlink w:anchor="_qq9jp6q027dj">
             <w:r>
               <w:rPr>
                 <w:rFonts w:ascii="Calibri" w:cs="Calibri" w:eastAsia="Calibri" w:hAnsi="Calibri"/>
@@ -1607,7 +1647,7 @@
           </w:hyperlink>
           <w:r>
             <w:fldChar w:fldCharType="begin"/>
-            <w:instrText xml:space="preserve"> PAGEREF _vt7hnet41m9p \h </w:instrText>
+            <w:instrText xml:space="preserve"> PAGEREF _qq9jp6q027dj \h </w:instrText>
             <w:fldChar w:fldCharType="separate"/>
           </w:r>
           <w:r>
@@ -1677,7 +1717,7 @@
               <w:vertAlign w:val="baseline"/>
             </w:rPr>
           </w:pPr>
-          <w:hyperlink w:anchor="_o8gw9xeofi2e">
+          <w:hyperlink w:anchor="_unqkzc2oc9m">
             <w:r>
               <w:rPr>
                 <w:rFonts w:ascii="Calibri" w:cs="Calibri" w:eastAsia="Calibri" w:hAnsi="Calibri"/>
@@ -1698,7 +1738,7 @@
               <w:t xml:space="preserve">2.1.</w:t>
             </w:r>
           </w:hyperlink>
-          <w:hyperlink w:anchor="_o8gw9xeofi2e">
+          <w:hyperlink w:anchor="_unqkzc2oc9m">
             <w:r>
               <w:rPr>
                 <w:rFonts w:ascii="Calibri" w:cs="Calibri" w:eastAsia="Calibri" w:hAnsi="Calibri"/>
@@ -1721,7 +1761,7 @@
           </w:hyperlink>
           <w:r>
             <w:fldChar w:fldCharType="begin"/>
-            <w:instrText xml:space="preserve"> PAGEREF _o8gw9xeofi2e \h </w:instrText>
+            <w:instrText xml:space="preserve"> PAGEREF _unqkzc2oc9m \h </w:instrText>
             <w:fldChar w:fldCharType="separate"/>
           </w:r>
           <w:r>
@@ -1791,7 +1831,7 @@
               <w:vertAlign w:val="baseline"/>
             </w:rPr>
           </w:pPr>
-          <w:hyperlink w:anchor="_warmr6ms2ppc">
+          <w:hyperlink w:anchor="_q6un914vlsw5">
             <w:r>
               <w:rPr>
                 <w:rFonts w:ascii="Calibri" w:cs="Calibri" w:eastAsia="Calibri" w:hAnsi="Calibri"/>
@@ -1812,7 +1852,7 @@
               <w:t xml:space="preserve">2.1.1.</w:t>
             </w:r>
           </w:hyperlink>
-          <w:hyperlink w:anchor="_warmr6ms2ppc">
+          <w:hyperlink w:anchor="_q6un914vlsw5">
             <w:r>
               <w:rPr>
                 <w:rFonts w:ascii="Calibri" w:cs="Calibri" w:eastAsia="Calibri" w:hAnsi="Calibri"/>
@@ -1835,7 +1875,7 @@
           </w:hyperlink>
           <w:r>
             <w:fldChar w:fldCharType="begin"/>
-            <w:instrText xml:space="preserve"> PAGEREF _warmr6ms2ppc \h </w:instrText>
+            <w:instrText xml:space="preserve"> PAGEREF _q6un914vlsw5 \h </w:instrText>
             <w:fldChar w:fldCharType="separate"/>
           </w:r>
           <w:r>
@@ -1905,7 +1945,7 @@
               <w:vertAlign w:val="baseline"/>
             </w:rPr>
           </w:pPr>
-          <w:hyperlink w:anchor="_jsbkqmmyrtft">
+          <w:hyperlink w:anchor="_pwq1zfhkss0f">
             <w:r>
               <w:rPr>
                 <w:rFonts w:ascii="Calibri" w:cs="Calibri" w:eastAsia="Calibri" w:hAnsi="Calibri"/>
@@ -1926,7 +1966,7 @@
               <w:t xml:space="preserve">2.1.1.1.</w:t>
             </w:r>
           </w:hyperlink>
-          <w:hyperlink w:anchor="_jsbkqmmyrtft">
+          <w:hyperlink w:anchor="_pwq1zfhkss0f">
             <w:r>
               <w:rPr>
                 <w:rFonts w:ascii="Calibri" w:cs="Calibri" w:eastAsia="Calibri" w:hAnsi="Calibri"/>
@@ -1949,7 +1989,7 @@
           </w:hyperlink>
           <w:r>
             <w:fldChar w:fldCharType="begin"/>
-            <w:instrText xml:space="preserve"> PAGEREF _jsbkqmmyrtft \h </w:instrText>
+            <w:instrText xml:space="preserve"> PAGEREF _pwq1zfhkss0f \h </w:instrText>
             <w:fldChar w:fldCharType="separate"/>
           </w:r>
           <w:r>
@@ -2019,7 +2059,7 @@
               <w:vertAlign w:val="baseline"/>
             </w:rPr>
           </w:pPr>
-          <w:hyperlink w:anchor="_woi43xxvykbo">
+          <w:hyperlink w:anchor="_s4fiskcqdpex">
             <w:r>
               <w:rPr>
                 <w:rFonts w:ascii="Calibri" w:cs="Calibri" w:eastAsia="Calibri" w:hAnsi="Calibri"/>
@@ -2040,7 +2080,7 @@
               <w:t xml:space="preserve">3.</w:t>
             </w:r>
           </w:hyperlink>
-          <w:hyperlink w:anchor="_woi43xxvykbo">
+          <w:hyperlink w:anchor="_s4fiskcqdpex">
             <w:r>
               <w:rPr>
                 <w:rFonts w:ascii="Calibri" w:cs="Calibri" w:eastAsia="Calibri" w:hAnsi="Calibri"/>
@@ -2063,7 +2103,7 @@
           </w:hyperlink>
           <w:r>
             <w:fldChar w:fldCharType="begin"/>
-            <w:instrText xml:space="preserve"> PAGEREF _woi43xxvykbo \h </w:instrText>
+            <w:instrText xml:space="preserve"> PAGEREF _s4fiskcqdpex \h </w:instrText>
             <w:fldChar w:fldCharType="separate"/>
           </w:r>
           <w:r>
@@ -2133,7 +2173,7 @@
               <w:vertAlign w:val="baseline"/>
             </w:rPr>
           </w:pPr>
-          <w:hyperlink w:anchor="_17dawzcb8ofy">
+          <w:hyperlink w:anchor="_xhtv9cm50lox">
             <w:r>
               <w:rPr>
                 <w:rFonts w:ascii="Calibri" w:cs="Calibri" w:eastAsia="Calibri" w:hAnsi="Calibri"/>
@@ -2154,7 +2194,7 @@
               <w:t xml:space="preserve">Bibliographical References  (</w:t>
             </w:r>
           </w:hyperlink>
-          <w:hyperlink w:anchor="_17dawzcb8ofy">
+          <w:hyperlink w:anchor="_xhtv9cm50lox">
             <w:r>
               <w:rPr>
                 <w:rFonts w:ascii="Calibri" w:cs="Calibri" w:eastAsia="Calibri" w:hAnsi="Calibri"/>
@@ -2175,7 +2215,7 @@
               <w:t xml:space="preserve">Optional, Not included in page limit</w:t>
             </w:r>
           </w:hyperlink>
-          <w:hyperlink w:anchor="_17dawzcb8ofy">
+          <w:hyperlink w:anchor="_xhtv9cm50lox">
             <w:r>
               <w:rPr>
                 <w:rFonts w:ascii="Calibri" w:cs="Calibri" w:eastAsia="Calibri" w:hAnsi="Calibri"/>
@@ -2241,7 +2281,7 @@
               <w:vertAlign w:val="baseline"/>
             </w:rPr>
           </w:pPr>
-          <w:hyperlink w:anchor="_k2rysrhkpfw4">
+          <w:hyperlink w:anchor="_mn87h6fi6r9x">
             <w:r>
               <w:rPr>
                 <w:rFonts w:ascii="Calibri" w:cs="Calibri" w:eastAsia="Calibri" w:hAnsi="Calibri"/>
@@ -2262,7 +2302,7 @@
               <w:t xml:space="preserve">Appendix A (</w:t>
             </w:r>
           </w:hyperlink>
-          <w:hyperlink w:anchor="_k2rysrhkpfw4">
+          <w:hyperlink w:anchor="_mn87h6fi6r9x">
             <w:r>
               <w:rPr>
                 <w:rFonts w:ascii="Calibri" w:cs="Calibri" w:eastAsia="Calibri" w:hAnsi="Calibri"/>
@@ -2283,7 +2323,7 @@
               <w:t xml:space="preserve">Optional, Not included in page limit</w:t>
             </w:r>
           </w:hyperlink>
-          <w:hyperlink w:anchor="_k2rysrhkpfw4">
+          <w:hyperlink w:anchor="_mn87h6fi6r9x">
             <w:r>
               <w:rPr>
                 <w:rFonts w:ascii="Calibri" w:cs="Calibri" w:eastAsia="Calibri" w:hAnsi="Calibri"/>
@@ -2349,7 +2389,7 @@
               <w:vertAlign w:val="baseline"/>
             </w:rPr>
           </w:pPr>
-          <w:hyperlink w:anchor="_gwvwdxzmujx">
+          <w:hyperlink w:anchor="_zytnxmza2lb">
             <w:r>
               <w:rPr>
                 <w:rFonts w:ascii="Calibri" w:cs="Calibri" w:eastAsia="Calibri" w:hAnsi="Calibri"/>
@@ -2370,7 +2410,7 @@
               <w:t xml:space="preserve">Annexes (</w:t>
             </w:r>
           </w:hyperlink>
-          <w:hyperlink w:anchor="_gwvwdxzmujx">
+          <w:hyperlink w:anchor="_zytnxmza2lb">
             <w:r>
               <w:rPr>
                 <w:rFonts w:ascii="Calibri" w:cs="Calibri" w:eastAsia="Calibri" w:hAnsi="Calibri"/>
@@ -2391,7 +2431,7 @@
               <w:t xml:space="preserve">Optional, Not included in page limit</w:t>
             </w:r>
           </w:hyperlink>
-          <w:hyperlink w:anchor="_gwvwdxzmujx">
+          <w:hyperlink w:anchor="_zytnxmza2lb">
             <w:r>
               <w:rPr>
                 <w:rFonts w:ascii="Calibri" w:cs="Calibri" w:eastAsia="Calibri" w:hAnsi="Calibri"/>
@@ -2462,7 +2502,7 @@
         <w:ind w:left="360" w:hanging="360"/>
         <w:rPr/>
       </w:pPr>
-      <w:bookmarkStart w:colFirst="0" w:colLast="0" w:name="_wv60qhocxjuv" w:id="0"/>
+      <w:bookmarkStart w:colFirst="0" w:colLast="0" w:name="_ge9i7ovi3rvx" w:id="0"/>
       <w:bookmarkEnd w:id="0"/>
       <w:r>
         <w:rPr>
@@ -2493,11 +2533,6 @@
           <w:rtl w:val="0"/>
         </w:rPr>
         <w:t xml:space="preserve">Data preparation therefore focused on constructing a customer level dataset that accurately reflects both behaviour and timing. Customer and flight datasets were integrated using a left join on the loyalty identifier to ensure that all customers, including those with low or no activity, remained represented. Targeted consistency checks were applied to remove logically invalid records, such as flight entries with zero travel distance, which are unlikely to represent real behaviour. Preserving temporal dynamics was a further priority. Rather than aggregating flight data directly, activity was first structured at a year month level to retain month wise and seasonal patterns before controlled aggregation. Building on this foundation, feature engineering is captured when customers travel through seasonal indicators and how they travel through normalised behavioural measures that account for tenure and activity span. Together, these steps ensured that the dataset used for segmentation provides a robust and behaviourally meaningful foundation for the analysis presented in this report.</w:t>
-      </w:r>
-      <w:r>
-        <w:rPr>
-          <w:rtl w:val="0"/>
-        </w:rPr>
       </w:r>
     </w:p>
     <w:p>
@@ -2508,9 +2543,7 @@
           <w:numId w:val="2"/>
         </w:numPr>
         <w:ind w:left="720" w:hanging="360"/>
-        <w:rPr>
-          <w:u w:val="none"/>
-        </w:rPr>
+        <w:rPr/>
       </w:pPr>
       <w:r>
         <w:rPr>
@@ -2518,6 +2551,11 @@
         </w:rPr>
         <w:t xml:space="preserve">Methodology:</w:t>
       </w:r>
+      <w:r>
+        <w:rPr>
+          <w:rtl w:val="0"/>
+        </w:rPr>
+      </w:r>
     </w:p>
     <w:p>
       <w:pPr>
@@ -2529,11 +2567,6 @@
           <w:rtl w:val="0"/>
         </w:rPr>
         <w:t xml:space="preserve">This section describes the analytical approach used to construct and evaluate customer segments for AIAI. The methodology was designed to balance statistical rigor with business interpretability, ensuring that the resulting segments are both analytically defensible and practically actionable.</w:t>
-      </w:r>
-      <w:r>
-        <w:rPr>
-          <w:rtl w:val="0"/>
-        </w:rPr>
       </w:r>
     </w:p>
     <w:p>
@@ -2545,8 +2578,9 @@
         </w:numPr>
         <w:spacing w:after="80" w:before="280" w:lineRule="auto"/>
         <w:ind w:left="1440" w:hanging="360"/>
-      </w:pPr>
-      <w:bookmarkStart w:colFirst="0" w:colLast="0" w:name="_ryizdf5qbe1c" w:id="1"/>
+        <w:rPr/>
+      </w:pPr>
+      <w:bookmarkStart w:colFirst="0" w:colLast="0" w:name="_z6pvo4id2alg" w:id="1"/>
       <w:bookmarkEnd w:id="1"/>
       <w:r>
         <w:rPr>
@@ -2565,11 +2599,6 @@
           <w:rtl w:val="0"/>
         </w:rPr>
         <w:t xml:space="preserve">Customer level and flight level datasets were combined using the loyalty identifier as the common key. A left join strategy was applied to ensure that all customers were retained in the analysis, including those with no recorded flight activity. This decision was important to avoid biasing the segmentation toward already active or engaged customers. Prior to merging, key fields were explicitly aligned in terms of data type and format to prevent silent join errors and ensure record level consistency.</w:t>
-      </w:r>
-      <w:r>
-        <w:rPr>
-          <w:rtl w:val="0"/>
-        </w:rPr>
       </w:r>
     </w:p>
     <w:p>
@@ -2581,8 +2610,9 @@
         </w:numPr>
         <w:spacing w:after="80" w:before="280" w:lineRule="auto"/>
         <w:ind w:left="1440" w:hanging="360"/>
-      </w:pPr>
-      <w:bookmarkStart w:colFirst="0" w:colLast="0" w:name="_tsax9wj3hss9" w:id="2"/>
+        <w:rPr/>
+      </w:pPr>
+      <w:bookmarkStart w:colFirst="0" w:colLast="0" w:name="_nxfwliqf0ost" w:id="2"/>
       <w:bookmarkEnd w:id="2"/>
       <w:r>
         <w:rPr>
@@ -2601,11 +2631,6 @@
           <w:rtl w:val="0"/>
         </w:rPr>
         <w:t xml:space="preserve">After integration, targeted validation checks were performed to identify logically invalid records that could distort downstream analysis. The focus was placed on structural inconsistencies rather than missing values alone. In particular, flight records with zero recorded travel distance were identified as invalid, as a completed flight necessarily implies a positive distance. These records were removed prior to aggregation to prevent erroneous values from propagating into customer level summaries and behavioural features. This conservative approach prioritised analytical integrity over maximising dataset size.</w:t>
-      </w:r>
-      <w:r>
-        <w:rPr>
-          <w:rtl w:val="0"/>
-        </w:rPr>
       </w:r>
     </w:p>
     <w:p>
@@ -2617,8 +2642,9 @@
         </w:numPr>
         <w:spacing w:after="80" w:before="280" w:lineRule="auto"/>
         <w:ind w:left="1440" w:hanging="360"/>
-      </w:pPr>
-      <w:bookmarkStart w:colFirst="0" w:colLast="0" w:name="_vx3ex13ctdfe" w:id="3"/>
+        <w:rPr/>
+      </w:pPr>
+      <w:bookmarkStart w:colFirst="0" w:colLast="0" w:name="_mk6xzj3e5qld" w:id="3"/>
       <w:bookmarkEnd w:id="3"/>
       <w:r>
         <w:rPr>
@@ -2637,11 +2663,6 @@
           <w:rtl w:val="0"/>
         </w:rPr>
         <w:t xml:space="preserve">Based on the monthly structure, temporal features were constructed to capture when customers travel rather than relying on raw calendar fields. Monthly flight indicators and counts were aggregated into seasonal flight volumes, allowing broader travel patterns to be identified while reducing dimensionality. A peak season indicator was introduced to capture summer travel behaviour, which serves as a proxy for leisure oriented travel in the absence of explicit trip purpose data. In addition, a dominant travel season was derived for each customer to provide a concise and interpretable summary of their primary temporal travel pattern.</w:t>
-      </w:r>
-      <w:r>
-        <w:rPr>
-          <w:rtl w:val="0"/>
-        </w:rPr>
       </w:r>
     </w:p>
     <w:p>
@@ -2653,8 +2674,9 @@
         </w:numPr>
         <w:spacing w:after="80" w:before="280" w:lineRule="auto"/>
         <w:ind w:left="1440" w:hanging="360"/>
-      </w:pPr>
-      <w:bookmarkStart w:colFirst="0" w:colLast="0" w:name="_p08y80773xwy" w:id="4"/>
+        <w:rPr/>
+      </w:pPr>
+      <w:bookmarkStart w:colFirst="0" w:colLast="0" w:name="_dq6hg3r1iur7" w:id="4"/>
       <w:bookmarkEnd w:id="4"/>
       <w:r>
         <w:rPr>
@@ -2673,11 +2695,6 @@
           <w:rtl w:val="0"/>
         </w:rPr>
         <w:t xml:space="preserve">Behavioural features were designed to capture how customers travel rather than simply how much they travel. Raw activity totals were normalised into per unit and ratio based measures to account for differences in tenure and activity span. These features include travel frequency per active month, value per flight, loyalty point redemption behaviour, average distance per flight, and the proportion of flights taken with companions. Normalisation allows customers with different engagement histories to be compared on a like for like basis and improves the stability and interpretability of clustering results.</w:t>
-      </w:r>
-      <w:r>
-        <w:rPr>
-          <w:rtl w:val="0"/>
-        </w:rPr>
       </w:r>
     </w:p>
     <w:p>
@@ -2691,8 +2708,9 @@
         </w:numPr>
         <w:spacing w:after="80" w:before="280" w:line="276" w:lineRule="auto"/>
         <w:ind w:left="1440" w:hanging="360"/>
-      </w:pPr>
-      <w:bookmarkStart w:colFirst="0" w:colLast="0" w:name="_y01h8r3zlfsh" w:id="5"/>
+        <w:rPr/>
+      </w:pPr>
+      <w:bookmarkStart w:colFirst="0" w:colLast="0" w:name="_wspor5i7oj2u" w:id="5"/>
       <w:bookmarkEnd w:id="5"/>
       <w:r>
         <w:rPr>
@@ -2735,11 +2753,6 @@
           <w:rtl w:val="0"/>
         </w:rPr>
         <w:t xml:space="preserve">Feature encoding followed a feature aware strategy to maintain numerical compatibility while preserving behavioural meaning. Low cardinality nominal features were one hot encoded to avoid imposing artificial order, while discretised features with inherent ordering were ordinally encoded to preserve relative magnitude. Finally, feature scaling was applied for distance based clustering methods to ensure proportional contribution of all numerical features. Scaling was applied consistently for K Means and hierarchical clustering, while RFM segmentation retained its original scale due to its rule based structure.</w:t>
-      </w:r>
-      <w:r>
-        <w:rPr>
-          <w:rtl w:val="0"/>
-        </w:rPr>
       </w:r>
     </w:p>
     <w:p>
@@ -2751,19 +2764,15 @@
         </w:numPr>
         <w:spacing w:after="80" w:before="280" w:lineRule="auto"/>
         <w:ind w:left="1440" w:hanging="360"/>
-      </w:pPr>
-      <w:bookmarkStart w:colFirst="0" w:colLast="0" w:name="_v4c6ej9xyzq5" w:id="6"/>
+        <w:rPr/>
+      </w:pPr>
+      <w:bookmarkStart w:colFirst="0" w:colLast="0" w:name="_uir87a4lgf2k" w:id="6"/>
       <w:bookmarkEnd w:id="6"/>
       <w:r>
         <w:rPr>
           <w:rtl w:val="0"/>
         </w:rPr>
         <w:t xml:space="preserve">Segmentation approach</w:t>
-      </w:r>
-      <w:r>
-        <w:rPr>
-          <w:rtl w:val="0"/>
-        </w:rPr>
       </w:r>
     </w:p>
     <w:p>
@@ -2777,11 +2786,6 @@
           <w:rtl w:val="0"/>
         </w:rPr>
         <w:t xml:space="preserve">To ensure robustness and avoid reliance on a single analytical perspective, multiple segmentation approaches were evaluated. Classical unsupervised clustering techniques were applied alongside a value driven segmentation framework. This allowed comparison between statistically derived clusters and segments that are more directly aligned with business concepts of customer value and engagement. Model selection and evaluation focused not only on separation metrics, but also on interpretability and practical relevance of the resulting customer groups.</w:t>
-      </w:r>
-      <w:r>
-        <w:rPr>
-          <w:rtl w:val="0"/>
-        </w:rPr>
       </w:r>
     </w:p>
     <w:p>
@@ -2811,7 +2815,7 @@
         <w:ind w:left="792" w:hanging="432"/>
         <w:rPr/>
       </w:pPr>
-      <w:bookmarkStart w:colFirst="0" w:colLast="0" w:name="_c9zj70d1focv" w:id="7"/>
+      <w:bookmarkStart w:colFirst="0" w:colLast="0" w:name="_5ugb4zidahse" w:id="7"/>
       <w:bookmarkEnd w:id="7"/>
       <w:r>
         <w:rPr>
@@ -2830,7 +2834,7 @@
         <w:ind w:left="1224" w:hanging="504.00000000000006"/>
         <w:rPr/>
       </w:pPr>
-      <w:bookmarkStart w:colFirst="0" w:colLast="0" w:name="_11dwbgnonooq" w:id="8"/>
+      <w:bookmarkStart w:colFirst="0" w:colLast="0" w:name="_mzuvud101h3f" w:id="8"/>
       <w:bookmarkEnd w:id="8"/>
       <w:r>
         <w:rPr>
@@ -2842,6 +2846,11 @@
         </w:rPr>
         <w:t xml:space="preserve">K-Means clustering results and validation</w:t>
       </w:r>
+      <w:r>
+        <w:rPr>
+          <w:rtl w:val="0"/>
+        </w:rPr>
+      </w:r>
     </w:p>
     <w:p>
       <w:pPr>
@@ -2877,11 +2886,6 @@
           <w:rtl w:val="0"/>
         </w:rPr>
         <w:t xml:space="preserve">Cluster profiling reveals clear differentiation across customer lifetime value, travel frequency, loyalty point behaviour, and tenure, forming intuitive value tiers (Fig 4, Appendix). Visualisation in reduced feature space confirms coherent cluster separation (Fig 5, Appendix). The cluster size distribution reflects a long tail value structure, with a dominant low value group and smaller high value segments (Fig 6, Appendix), supporting the selection of a four cluster K Means solution.</w:t>
-      </w:r>
-      <w:r>
-        <w:rPr>
-          <w:rtl w:val="0"/>
-        </w:rPr>
       </w:r>
     </w:p>
     <w:p>
@@ -2894,7 +2898,7 @@
         <w:ind w:left="1224" w:hanging="504.00000000000006"/>
         <w:rPr/>
       </w:pPr>
-      <w:bookmarkStart w:colFirst="0" w:colLast="0" w:name="_ps2ybjbrq6yu" w:id="9"/>
+      <w:bookmarkStart w:colFirst="0" w:colLast="0" w:name="_tanyc2yohyu6" w:id="9"/>
       <w:bookmarkEnd w:id="9"/>
       <w:r>
         <w:rPr>
@@ -2976,13 +2980,18 @@
         </w:rPr>
         <w:t xml:space="preserve">RFM segmentation results and validation:</w:t>
       </w:r>
+      <w:r>
+        <w:rPr>
+          <w:rtl w:val="0"/>
+        </w:rPr>
+      </w:r>
     </w:p>
     <w:p>
       <w:pPr>
         <w:spacing w:after="240" w:before="240" w:line="240" w:lineRule="auto"/>
         <w:rPr/>
       </w:pPr>
-      <w:bookmarkStart w:colFirst="0" w:colLast="0" w:name="_3151p5fr0eit" w:id="10"/>
+      <w:bookmarkStart w:colFirst="0" w:colLast="0" w:name="_5dbe70yxjitb" w:id="10"/>
       <w:bookmarkEnd w:id="10"/>
       <w:r>
         <w:rPr>
@@ -2996,8 +3005,6 @@
         <w:spacing w:after="240" w:before="240" w:line="240" w:lineRule="auto"/>
         <w:rPr/>
       </w:pPr>
-      <w:bookmarkStart w:colFirst="0" w:colLast="0" w:name="_3151p5fr0eit" w:id="10"/>
-      <w:bookmarkEnd w:id="10"/>
       <w:r>
         <w:rPr>
           <w:rtl w:val="0"/>
@@ -3010,18 +3017,11 @@
         <w:spacing w:after="240" w:before="240" w:line="240" w:lineRule="auto"/>
         <w:rPr/>
       </w:pPr>
-      <w:bookmarkStart w:colFirst="0" w:colLast="0" w:name="_3151p5fr0eit" w:id="10"/>
-      <w:bookmarkEnd w:id="10"/>
       <w:r>
         <w:rPr>
           <w:rtl w:val="0"/>
         </w:rPr>
         <w:t xml:space="preserve">Average RFM scores follow the same structure. Champions score highest across recency, frequency, and monetary dimensions, followed by Loyal customers. Potential Loyalists occupy an intermediate position, while At Risk and Lost segments display consistently lower scores across all three dimensions (Fig 14, Appendix).</w:t>
-      </w:r>
-      <w:r>
-        <w:rPr>
-          <w:rtl w:val="0"/>
-        </w:rPr>
       </w:r>
     </w:p>
     <w:p>
@@ -3042,6 +3042,11 @@
         </w:rPr>
         <w:t xml:space="preserve"> Conclusion: Value-Based Segmentation</w:t>
       </w:r>
+      <w:r>
+        <w:rPr>
+          <w:rtl w:val="0"/>
+        </w:rPr>
+      </w:r>
     </w:p>
     <w:p>
       <w:pPr>
@@ -3151,11 +3156,6 @@
         </w:rPr>
         <w:t xml:space="preserve">To isolate temporal behaviour, clustering was performed using features that represent seasonal distribution rather than raw flight counts. This ensures customers are grouped by timing patterns rather than usage intensity. Both K Means and hierarchical clustering were applied within this framework to assess the stability and interpretability of seasonal segments.</w:t>
       </w:r>
-      <w:r>
-        <w:rPr>
-          <w:rtl w:val="0"/>
-        </w:rPr>
-      </w:r>
     </w:p>
     <w:p>
       <w:pPr>
@@ -3171,13 +3171,7 @@
         <w:rPr>
           <w:rtl w:val="0"/>
         </w:rPr>
-        <w:t xml:space="preserve">K Means results and validation</w:t>
-      </w:r>
-      <w:r>
-        <w:rPr>
-          <w:rtl w:val="0"/>
-        </w:rPr>
-        <w:t xml:space="preserve">:</w:t>
+        <w:t xml:space="preserve">K Means results and validation:</w:t>
       </w:r>
     </w:p>
     <w:p>
@@ -3242,6 +3236,11 @@
         </w:rPr>
         <w:t xml:space="preserve">:</w:t>
       </w:r>
+      <w:r>
+        <w:rPr>
+          <w:rtl w:val="0"/>
+        </w:rPr>
+      </w:r>
     </w:p>
     <w:p>
       <w:pPr>
@@ -3346,6 +3345,373 @@
     </w:p>
     <w:p>
       <w:pPr>
+        <w:spacing w:after="240" w:before="240" w:lineRule="auto"/>
+        <w:rPr/>
+      </w:pPr>
+      <w:r>
+        <w:rPr>
+          <w:rtl w:val="0"/>
+        </w:rPr>
+      </w:r>
+    </w:p>
+    <w:p>
+      <w:pPr>
+        <w:numPr>
+          <w:ilvl w:val="1"/>
+          <w:numId w:val="1"/>
+        </w:numPr>
+        <w:spacing w:after="0" w:afterAutospacing="0" w:before="240" w:lineRule="auto"/>
+        <w:ind w:left="792" w:hanging="432"/>
+        <w:rPr>
+          <w:b w:val="1"/>
+          <w:bCs w:val="1"/>
+          <w:sz w:val="28"/>
+          <w:szCs w:val="28"/>
+        </w:rPr>
+      </w:pPr>
+      <w:r>
+        <w:rPr>
+          <w:b w:val="1"/>
+          <w:bCs w:val="1"/>
+          <w:sz w:val="28"/>
+          <w:szCs w:val="28"/>
+          <w:rtl w:val="0"/>
+        </w:rPr>
+        <w:t xml:space="preserve">Behavioral Segmentation</w:t>
+      </w:r>
+      <w:r>
+        <w:rPr>
+          <w:rtl w:val="0"/>
+        </w:rPr>
+      </w:r>
+    </w:p>
+    <w:p>
+      <w:pPr>
+        <w:numPr>
+          <w:ilvl w:val="2"/>
+          <w:numId w:val="1"/>
+        </w:numPr>
+        <w:spacing w:after="240" w:before="0" w:beforeAutospacing="0" w:lineRule="auto"/>
+        <w:ind w:left="1224" w:hanging="504.00000000000006"/>
+        <w:rPr>
+          <w:u w:val="none"/>
+        </w:rPr>
+      </w:pPr>
+      <w:r>
+        <w:rPr>
+          <w:rtl w:val="0"/>
+        </w:rPr>
+        <w:t xml:space="preserve"> </w:t>
+      </w:r>
+      <w:r>
+        <w:rPr>
+          <w:b w:val="1"/>
+          <w:bCs w:val="1"/>
+          <w:sz w:val="28"/>
+          <w:szCs w:val="28"/>
+          <w:rtl w:val="0"/>
+        </w:rPr>
+        <w:t xml:space="preserve">Hierarchical clustering results and validation</w:t>
+      </w:r>
+    </w:p>
+    <w:p>
+      <w:pPr>
+        <w:spacing w:after="240" w:before="240" w:lineRule="auto"/>
+        <w:ind w:left="0" w:firstLine="0"/>
+        <w:rPr/>
+      </w:pPr>
+      <w:r>
+        <w:rPr>
+          <w:rtl w:val="0"/>
+        </w:rPr>
+        <w:t xml:space="preserve">To identify the natural grouping structure of the behavioral data without imposing a pre-defined number of clusters, Hierarchical clustering was applied first. Ward’s linkage method was selected to minimize within-cluster variance, which aligns with the objective of creating compact, distinct segments. The resulting dendrogram reveals a distinct hierarchical structure where the longest vertical branches, representing the most stable clusters, occur at a cut-off point of four clusters (Fig 24, Appendix). Comparisons with other linkage methods (Single, Complete) confirmed that Ward linkage produced the most balanced partition, avoiding the "chaining" effect where clusters become elongated and uninterpretable (Fig 24, Appendix). This structural analysis provided the primary justification for setting k=4 in subsequent centroid-based modeling.</w:t>
+      </w:r>
+      <w:r>
+        <w:rPr>
+          <w:rtl w:val="0"/>
+        </w:rPr>
+      </w:r>
+    </w:p>
+    <w:p>
+      <w:pPr>
+        <w:numPr>
+          <w:ilvl w:val="2"/>
+          <w:numId w:val="1"/>
+        </w:numPr>
+        <w:spacing w:after="240" w:before="240" w:lineRule="auto"/>
+        <w:ind w:left="1224" w:hanging="504.00000000000006"/>
+        <w:rPr>
+          <w:u w:val="none"/>
+        </w:rPr>
+      </w:pPr>
+      <w:r>
+        <w:rPr>
+          <w:rtl w:val="0"/>
+        </w:rPr>
+        <w:t xml:space="preserve"> </w:t>
+      </w:r>
+      <w:r>
+        <w:rPr>
+          <w:b w:val="1"/>
+          <w:bCs w:val="1"/>
+          <w:sz w:val="28"/>
+          <w:szCs w:val="28"/>
+          <w:rtl w:val="0"/>
+        </w:rPr>
+        <w:t xml:space="preserve">Density-based (DBSCAN) results and validation</w:t>
+      </w:r>
+    </w:p>
+    <w:p>
+      <w:pPr>
+        <w:spacing w:after="240" w:before="240" w:lineRule="auto"/>
+        <w:ind w:left="0" w:firstLine="0"/>
+        <w:rPr/>
+      </w:pPr>
+      <w:r>
+        <w:rPr>
+          <w:rtl w:val="0"/>
+        </w:rPr>
+        <w:t xml:space="preserve">DBSCAN was applied to assess the density and continuity of the behavioral clusters. The analysis revealed that while the "Dormant" and "International Elite" groups form dense, separated regions, the boundary between "Savvy" and "Sleepy" users is less spatially distinct, often bridged by transitional users. This confirms that while the groups are behaviorally distinct, they exist on a continuum of engagement. DBSCAN identified distinct outliers in the high-distance spectrum, validating the "International Elite" as a mathematically distinct anomaly rather than just the tail end of a normal distribution.</w:t>
+      </w:r>
+    </w:p>
+    <w:p>
+      <w:pPr>
+        <w:numPr>
+          <w:ilvl w:val="2"/>
+          <w:numId w:val="1"/>
+        </w:numPr>
+        <w:spacing w:after="240" w:before="240" w:lineRule="auto"/>
+        <w:ind w:left="1224" w:hanging="504.00000000000006"/>
+        <w:rPr>
+          <w:u w:val="none"/>
+        </w:rPr>
+      </w:pPr>
+      <w:r>
+        <w:rPr>
+          <w:rtl w:val="0"/>
+        </w:rPr>
+        <w:t xml:space="preserve"> </w:t>
+      </w:r>
+      <w:r>
+        <w:rPr>
+          <w:b w:val="1"/>
+          <w:bCs w:val="1"/>
+          <w:sz w:val="28"/>
+          <w:szCs w:val="28"/>
+          <w:rtl w:val="0"/>
+        </w:rPr>
+        <w:t xml:space="preserve">K-Means clustering results and validation</w:t>
+      </w:r>
+    </w:p>
+    <w:p>
+      <w:pPr>
+        <w:spacing w:after="240" w:before="240" w:lineRule="auto"/>
+        <w:rPr/>
+      </w:pPr>
+      <w:r>
+        <w:rPr>
+          <w:rtl w:val="0"/>
+        </w:rPr>
+        <w:t xml:space="preserve">The application of K-Means clustering to the normalized behavioral metrics provided the most robust and actionable segmentation framework. The determination of the optimal cluster count was driven by a rigorous evaluation of variance stability and structural cohesion. The combined technical validation is presented in (</w:t>
+      </w:r>
+      <w:r>
+        <w:rPr>
+          <w:b w:val="1"/>
+          <w:bCs w:val="1"/>
+          <w:rtl w:val="0"/>
+        </w:rPr>
+        <w:t xml:space="preserve">Figure 25, Appendix)</w:t>
+      </w:r>
+      <w:r>
+        <w:rPr>
+          <w:rtl w:val="0"/>
+        </w:rPr>
+        <w:t xml:space="preserve">, where the inertia analysis reveals a pronounced inflection point (elbow) at four clusters. This structural decision is strongly reinforced by the accompanying silhouette analysis, which confirms that the four-cluster configuration maintains a positive profile for the majority of samples, indicating that customers are well-matched to their assigned behavioral segments without artificial fragmentation.</w:t>
+      </w:r>
+    </w:p>
+    <w:p>
+      <w:pPr>
+        <w:spacing w:after="240" w:before="240" w:lineRule="auto"/>
+        <w:rPr/>
+      </w:pPr>
+      <w:r>
+        <w:rPr>
+          <w:rtl w:val="0"/>
+        </w:rPr>
+        <w:t xml:space="preserve">The resulting segments exhibit unique behavioral signatures that validate the business relevance of the model. As visualized in the standardized "Snake Plot" </w:t>
+      </w:r>
+      <w:r>
+        <w:rPr>
+          <w:b w:val="1"/>
+          <w:bCs w:val="1"/>
+          <w:rtl w:val="0"/>
+        </w:rPr>
+        <w:t xml:space="preserve">(Figure 26, Appendix)</w:t>
+      </w:r>
+      <w:r>
+        <w:rPr>
+          <w:rtl w:val="0"/>
+        </w:rPr>
+        <w:t xml:space="preserve">, the four personas display distinct shapes rather than simple magnitude differences. This profile view mathematically distinguishes the "International Elite" as extreme outliers (Z-score &gt; 3), while simultaneously delineating the "Dormant" segment, which consistently tracks below the population average. Crucially, the Relative Importance plot </w:t>
+      </w:r>
+      <w:r>
+        <w:rPr>
+          <w:b w:val="1"/>
+          <w:bCs w:val="1"/>
+          <w:rtl w:val="0"/>
+        </w:rPr>
+        <w:t xml:space="preserve">(Figure 27, Appendix)</w:t>
+      </w:r>
+      <w:r>
+        <w:rPr>
+          <w:rtl w:val="0"/>
+        </w:rPr>
+        <w:t xml:space="preserve"> quantifies these deviations, highlighting that the "Savvy Loyalists" are defined specifically by a positive deviation in redemption activity compared to the average, whereas "Sleepy" users show negative deviations in engagement despite high flight volumes.</w:t>
+      </w:r>
+    </w:p>
+    <w:p>
+      <w:pPr>
+        <w:spacing w:after="240" w:before="240" w:lineRule="auto"/>
+        <w:rPr/>
+      </w:pPr>
+      <w:r>
+        <w:rPr>
+          <w:rtl w:val="0"/>
+        </w:rPr>
+        <w:t xml:space="preserve">To ensure robustness, we analyzed the pairwise relationships between all features </w:t>
+      </w:r>
+      <w:r>
+        <w:rPr>
+          <w:b w:val="1"/>
+          <w:bCs w:val="1"/>
+          <w:rtl w:val="0"/>
+        </w:rPr>
+        <w:t xml:space="preserve">(Figure 28, Appendix)</w:t>
+      </w:r>
+      <w:r>
+        <w:rPr>
+          <w:rtl w:val="0"/>
+        </w:rPr>
+        <w:t xml:space="preserve">. This multivariate view confirms that the "International Elite" form a distinct, detached cluster in the distance dimension, while the "Savvy" and "Sleepy" segments are entangled in frequency but separable in engagement metrics. This distinction is further clarified by examining the distribution of flight frequency </w:t>
+      </w:r>
+      <w:r>
+        <w:rPr>
+          <w:b w:val="1"/>
+          <w:bCs w:val="1"/>
+          <w:rtl w:val="0"/>
+        </w:rPr>
+        <w:t xml:space="preserve">(Figure 29, Appendix)</w:t>
+      </w:r>
+      <w:r>
+        <w:rPr>
+          <w:rtl w:val="0"/>
+        </w:rPr>
+        <w:t xml:space="preserve">, which shows that both frequent-flyer groups share nearly identical travel intensity distributions. The divergence is purely behavioral, not operational.</w:t>
+      </w:r>
+    </w:p>
+    <w:p>
+      <w:pPr>
+        <w:spacing w:after="240" w:before="240" w:lineRule="auto"/>
+        <w:rPr/>
+      </w:pPr>
+      <w:r>
+        <w:rPr>
+          <w:rtl w:val="0"/>
+        </w:rPr>
+        <w:t xml:space="preserve">Finally, the strategic differentiation between segments is best summarized by the "Earning Power vs. Burning Power" view </w:t>
+      </w:r>
+      <w:r>
+        <w:rPr>
+          <w:b w:val="1"/>
+          <w:bCs w:val="1"/>
+          <w:rtl w:val="0"/>
+        </w:rPr>
+        <w:t xml:space="preserve">(Figure 30, Appendix)</w:t>
+      </w:r>
+      <w:r>
+        <w:rPr>
+          <w:rtl w:val="0"/>
+        </w:rPr>
+        <w:t xml:space="preserve">. This visualization maps points accumulation against redemption behavior. It explicitly separates the "Savvy Loyalists" (High Burn) from the "Sleepy Frequent Flyers" (Low Burn) and isolates the "International Elite" (High Earn) as a unique high-leverage group. This confirms that the model has successfully disentangled the correlation between earning (flying) and burning (loyalty), providing the necessary granularity for targeted intervention.</w:t>
+      </w:r>
+    </w:p>
+    <w:p>
+      <w:pPr>
+        <w:numPr>
+          <w:ilvl w:val="2"/>
+          <w:numId w:val="1"/>
+        </w:numPr>
+        <w:spacing w:after="240" w:before="240" w:lineRule="auto"/>
+        <w:ind w:left="1224" w:hanging="504.00000000000006"/>
+      </w:pPr>
+      <w:r>
+        <w:rPr>
+          <w:b w:val="1"/>
+          <w:bCs w:val="1"/>
+          <w:sz w:val="28"/>
+          <w:szCs w:val="28"/>
+          <w:rtl w:val="0"/>
+        </w:rPr>
+        <w:t xml:space="preserve"> Conclusion: Behavioral Segmentation</w:t>
+      </w:r>
+    </w:p>
+    <w:p>
+      <w:pPr>
+        <w:spacing w:after="240" w:before="240" w:lineRule="auto"/>
+        <w:ind w:left="0" w:firstLine="0"/>
+        <w:rPr/>
+      </w:pPr>
+      <w:r>
+        <w:rPr>
+          <w:rtl w:val="0"/>
+        </w:rPr>
+        <w:t xml:space="preserve">Behavioral segmentation was examined to understand </w:t>
+      </w:r>
+      <w:r>
+        <w:rPr>
+          <w:i w:val="1"/>
+          <w:iCs w:val="1"/>
+          <w:rtl w:val="0"/>
+        </w:rPr>
+        <w:t xml:space="preserve">how</w:t>
+      </w:r>
+      <w:r>
+        <w:rPr>
+          <w:rtl w:val="0"/>
+        </w:rPr>
+        <w:t xml:space="preserve"> customers interact with the airline, complementing the </w:t>
+      </w:r>
+      <w:r>
+        <w:rPr>
+          <w:i w:val="1"/>
+          <w:iCs w:val="1"/>
+          <w:rtl w:val="0"/>
+        </w:rPr>
+        <w:t xml:space="preserve">value perspective</w:t>
+      </w:r>
+      <w:r>
+        <w:rPr>
+          <w:rtl w:val="0"/>
+        </w:rPr>
+        <w:t xml:space="preserve">. While Hierarchical clustering confirmed the natural structure of the data and DBSCAN validated the existence of high-value outliers, </w:t>
+      </w:r>
+      <w:r>
+        <w:rPr>
+          <w:b w:val="1"/>
+          <w:bCs w:val="1"/>
+          <w:rtl w:val="0"/>
+        </w:rPr>
+        <w:t xml:space="preserve">K-Means clustering</w:t>
+      </w:r>
+      <w:r>
+        <w:rPr>
+          <w:rtl w:val="0"/>
+        </w:rPr>
+        <w:t xml:space="preserve"> provided the most robust and actionable segmentation framework. The K-Means solution successfully disentangled the correlation between "Frequency" and "Engagement," revealing the critical "Sleepy Frequent Flyer" segment, a group that flies often but ignores the loyalty program. This distinction is invisible in pure Value-Based segmentation (where these users would simply be grouped with high-value customers) but is the most valuable insight for operational strategy. Therefore, the four-cluster K-Means solution is selected as the primary framework for behavioral analysis.</w:t>
+      </w:r>
+    </w:p>
+    <w:p>
+      <w:pPr>
         <w:pStyle w:val="Heading1"/>
         <w:numPr>
           <w:ilvl w:val="0"/>
@@ -3354,7 +3720,7 @@
         <w:ind w:left="360" w:hanging="360"/>
         <w:rPr/>
       </w:pPr>
-      <w:bookmarkStart w:colFirst="0" w:colLast="0" w:name="_17dawzcb8ofy" w:id="11"/>
+      <w:bookmarkStart w:colFirst="0" w:colLast="0" w:name="_xhtv9cm50lox" w:id="11"/>
       <w:bookmarkEnd w:id="11"/>
       <w:r>
         <w:rPr>
@@ -3508,7 +3874,7 @@
         <w:pStyle w:val="Heading1"/>
         <w:rPr/>
       </w:pPr>
-      <w:bookmarkStart w:colFirst="0" w:colLast="0" w:name="_k2rysrhkpfw4" w:id="12"/>
+      <w:bookmarkStart w:colFirst="0" w:colLast="0" w:name="_mn87h6fi6r9x" w:id="12"/>
       <w:bookmarkEnd w:id="12"/>
       <w:r>
         <w:rPr>
@@ -3538,12 +3904,12 @@
           <wp:inline distB="114300" distT="114300" distL="114300" distR="114300">
             <wp:extent cx="5759140" cy="3187700"/>
             <wp:effectExtent b="0" l="0" r="0" t="0"/>
-            <wp:docPr id="10" name="image14.png"/>
+            <wp:docPr id="9" name="image9.png"/>
             <a:graphic>
               <a:graphicData uri="http://schemas.openxmlformats.org/drawingml/2006/picture">
                 <pic:pic>
                   <pic:nvPicPr>
-                    <pic:cNvPr id="0" name="image14.png"/>
+                    <pic:cNvPr id="0" name="image9.png"/>
                     <pic:cNvPicPr preferRelativeResize="0"/>
                   </pic:nvPicPr>
                   <pic:blipFill>
@@ -3594,12 +3960,12 @@
           <wp:inline distB="114300" distT="114300" distL="114300" distR="114300">
             <wp:extent cx="5759140" cy="3302000"/>
             <wp:effectExtent b="0" l="0" r="0" t="0"/>
-            <wp:docPr id="11" name="image6.png"/>
+            <wp:docPr id="11" name="image7.png"/>
             <a:graphic>
               <a:graphicData uri="http://schemas.openxmlformats.org/drawingml/2006/picture">
                 <pic:pic>
                   <pic:nvPicPr>
-                    <pic:cNvPr id="0" name="image6.png"/>
+                    <pic:cNvPr id="0" name="image7.png"/>
                     <pic:cNvPicPr preferRelativeResize="0"/>
                   </pic:nvPicPr>
                   <pic:blipFill>
@@ -3652,12 +4018,12 @@
           <wp:inline distB="114300" distT="114300" distL="114300" distR="114300">
             <wp:extent cx="5759140" cy="3365500"/>
             <wp:effectExtent b="0" l="0" r="0" t="0"/>
-            <wp:docPr id="22" name="image20.png"/>
+            <wp:docPr id="10" name="image8.png"/>
             <a:graphic>
               <a:graphicData uri="http://schemas.openxmlformats.org/drawingml/2006/picture">
                 <pic:pic>
                   <pic:nvPicPr>
-                    <pic:cNvPr id="0" name="image20.png"/>
+                    <pic:cNvPr id="0" name="image8.png"/>
                     <pic:cNvPicPr preferRelativeResize="0"/>
                   </pic:nvPicPr>
                   <pic:blipFill>
@@ -3713,12 +4079,12 @@
           <wp:inline distB="114300" distT="114300" distL="114300" distR="114300">
             <wp:extent cx="5759140" cy="2743200"/>
             <wp:effectExtent b="0" l="0" r="0" t="0"/>
-            <wp:docPr id="9" name="image11.png"/>
+            <wp:docPr id="14" name="image4.png"/>
             <a:graphic>
               <a:graphicData uri="http://schemas.openxmlformats.org/drawingml/2006/picture">
                 <pic:pic>
                   <pic:nvPicPr>
-                    <pic:cNvPr id="0" name="image11.png"/>
+                    <pic:cNvPr id="0" name="image4.png"/>
                     <pic:cNvPicPr preferRelativeResize="0"/>
                   </pic:nvPicPr>
                   <pic:blipFill>
@@ -3785,12 +4151,12 @@
           <wp:inline distB="114300" distT="114300" distL="114300" distR="114300">
             <wp:extent cx="5759140" cy="5232400"/>
             <wp:effectExtent b="0" l="0" r="0" t="0"/>
-            <wp:docPr id="19" name="image22.png"/>
+            <wp:docPr id="12" name="image1.png"/>
             <a:graphic>
               <a:graphicData uri="http://schemas.openxmlformats.org/drawingml/2006/picture">
                 <pic:pic>
                   <pic:nvPicPr>
-                    <pic:cNvPr id="0" name="image22.png"/>
+                    <pic:cNvPr id="0" name="image1.png"/>
                     <pic:cNvPicPr preferRelativeResize="0"/>
                   </pic:nvPicPr>
                   <pic:blipFill>
@@ -3869,12 +4235,12 @@
           <wp:inline distB="114300" distT="114300" distL="114300" distR="114300">
             <wp:extent cx="5759140" cy="3606800"/>
             <wp:effectExtent b="0" l="0" r="0" t="0"/>
-            <wp:docPr id="18" name="image4.png"/>
+            <wp:docPr id="16" name="image13.png"/>
             <a:graphic>
               <a:graphicData uri="http://schemas.openxmlformats.org/drawingml/2006/picture">
                 <pic:pic>
                   <pic:nvPicPr>
-                    <pic:cNvPr id="0" name="image4.png"/>
+                    <pic:cNvPr id="0" name="image13.png"/>
                     <pic:cNvPicPr preferRelativeResize="0"/>
                   </pic:nvPicPr>
                   <pic:blipFill>
@@ -3929,12 +4295,12 @@
           <wp:inline distB="114300" distT="114300" distL="114300" distR="114300">
             <wp:extent cx="5759140" cy="2984500"/>
             <wp:effectExtent b="0" l="0" r="0" t="0"/>
-            <wp:docPr id="4" name="image15.png"/>
+            <wp:docPr id="15" name="image11.png"/>
             <a:graphic>
               <a:graphicData uri="http://schemas.openxmlformats.org/drawingml/2006/picture">
                 <pic:pic>
                   <pic:nvPicPr>
-                    <pic:cNvPr id="0" name="image15.png"/>
+                    <pic:cNvPr id="0" name="image11.png"/>
                     <pic:cNvPicPr preferRelativeResize="0"/>
                   </pic:nvPicPr>
                   <pic:blipFill>
@@ -4001,12 +4367,12 @@
           <wp:inline distB="114300" distT="114300" distL="114300" distR="114300">
             <wp:extent cx="5771833" cy="2333625"/>
             <wp:effectExtent b="0" l="0" r="0" t="0"/>
-            <wp:docPr id="15" name="image7.png"/>
+            <wp:docPr id="18" name="image6.png"/>
             <a:graphic>
               <a:graphicData uri="http://schemas.openxmlformats.org/drawingml/2006/picture">
                 <pic:pic>
                   <pic:nvPicPr>
-                    <pic:cNvPr id="0" name="image7.png"/>
+                    <pic:cNvPr id="0" name="image6.png"/>
                     <pic:cNvPicPr preferRelativeResize="0"/>
                   </pic:nvPicPr>
                   <pic:blipFill>
@@ -4061,12 +4427,12 @@
           <wp:inline distB="114300" distT="114300" distL="114300" distR="114300">
             <wp:extent cx="5314633" cy="4276725"/>
             <wp:effectExtent b="0" l="0" r="0" t="0"/>
-            <wp:docPr id="20" name="image10.png"/>
+            <wp:docPr id="17" name="image14.png"/>
             <a:graphic>
               <a:graphicData uri="http://schemas.openxmlformats.org/drawingml/2006/picture">
                 <pic:pic>
                   <pic:nvPicPr>
-                    <pic:cNvPr id="0" name="image10.png"/>
+                    <pic:cNvPr id="0" name="image14.png"/>
                     <pic:cNvPicPr preferRelativeResize="0"/>
                   </pic:nvPicPr>
                   <pic:blipFill>
@@ -4121,12 +4487,12 @@
           <wp:inline distB="114300" distT="114300" distL="114300" distR="114300">
             <wp:extent cx="5286058" cy="3362325"/>
             <wp:effectExtent b="0" l="0" r="0" t="0"/>
-            <wp:docPr id="5" name="image18.png"/>
+            <wp:docPr id="21" name="image19.png"/>
             <a:graphic>
               <a:graphicData uri="http://schemas.openxmlformats.org/drawingml/2006/picture">
                 <pic:pic>
                   <pic:nvPicPr>
-                    <pic:cNvPr id="0" name="image18.png"/>
+                    <pic:cNvPr id="0" name="image19.png"/>
                     <pic:cNvPicPr preferRelativeResize="0"/>
                   </pic:nvPicPr>
                   <pic:blipFill>
@@ -4193,12 +4559,12 @@
           <wp:inline distB="114300" distT="114300" distL="114300" distR="114300">
             <wp:extent cx="5105083" cy="2705100"/>
             <wp:effectExtent b="0" l="0" r="0" t="0"/>
-            <wp:docPr id="13" name="image12.png"/>
+            <wp:docPr id="19" name="image2.png"/>
             <a:graphic>
               <a:graphicData uri="http://schemas.openxmlformats.org/drawingml/2006/picture">
                 <pic:pic>
                   <pic:nvPicPr>
-                    <pic:cNvPr id="0" name="image12.png"/>
+                    <pic:cNvPr id="0" name="image2.png"/>
                     <pic:cNvPicPr preferRelativeResize="0"/>
                   </pic:nvPicPr>
                   <pic:blipFill>
@@ -4265,12 +4631,12 @@
           <wp:inline distB="114300" distT="114300" distL="114300" distR="114300">
             <wp:extent cx="5759140" cy="2882900"/>
             <wp:effectExtent b="0" l="0" r="0" t="0"/>
-            <wp:docPr id="2" name="image19.png"/>
+            <wp:docPr id="20" name="image5.png"/>
             <a:graphic>
               <a:graphicData uri="http://schemas.openxmlformats.org/drawingml/2006/picture">
                 <pic:pic>
                   <pic:nvPicPr>
-                    <pic:cNvPr id="0" name="image19.png"/>
+                    <pic:cNvPr id="0" name="image5.png"/>
                     <pic:cNvPicPr preferRelativeResize="0"/>
                   </pic:nvPicPr>
                   <pic:blipFill>
@@ -4325,12 +4691,12 @@
           <wp:inline distB="114300" distT="114300" distL="114300" distR="114300">
             <wp:extent cx="5759140" cy="2844800"/>
             <wp:effectExtent b="0" l="0" r="0" t="0"/>
-            <wp:docPr id="23" name="image23.png"/>
+            <wp:docPr id="22" name="image12.png"/>
             <a:graphic>
               <a:graphicData uri="http://schemas.openxmlformats.org/drawingml/2006/picture">
                 <pic:pic>
                   <pic:nvPicPr>
-                    <pic:cNvPr id="0" name="image23.png"/>
+                    <pic:cNvPr id="0" name="image12.png"/>
                     <pic:cNvPicPr preferRelativeResize="0"/>
                   </pic:nvPicPr>
                   <pic:blipFill>
@@ -4385,12 +4751,12 @@
           <wp:inline distB="114300" distT="114300" distL="114300" distR="114300">
             <wp:extent cx="5759140" cy="2984500"/>
             <wp:effectExtent b="0" l="0" r="0" t="0"/>
-            <wp:docPr id="17" name="image5.png"/>
+            <wp:docPr id="23" name="image18.png"/>
             <a:graphic>
               <a:graphicData uri="http://schemas.openxmlformats.org/drawingml/2006/picture">
                 <pic:pic>
                   <pic:nvPicPr>
-                    <pic:cNvPr id="0" name="image5.png"/>
+                    <pic:cNvPr id="0" name="image18.png"/>
                     <pic:cNvPicPr preferRelativeResize="0"/>
                   </pic:nvPicPr>
                   <pic:blipFill>
@@ -4469,12 +4835,12 @@
           <wp:inline distB="114300" distT="114300" distL="114300" distR="114300">
             <wp:extent cx="5276533" cy="2828925"/>
             <wp:effectExtent b="0" l="0" r="0" t="0"/>
-            <wp:docPr id="16" name="image1.png"/>
+            <wp:docPr id="24" name="image15.png"/>
             <a:graphic>
               <a:graphicData uri="http://schemas.openxmlformats.org/drawingml/2006/picture">
                 <pic:pic>
                   <pic:nvPicPr>
-                    <pic:cNvPr id="0" name="image1.png"/>
+                    <pic:cNvPr id="0" name="image15.png"/>
                     <pic:cNvPicPr preferRelativeResize="0"/>
                   </pic:nvPicPr>
                   <pic:blipFill>
@@ -4534,7 +4900,7 @@
         <w:jc w:val="left"/>
         <w:rPr/>
       </w:pPr>
-      <w:bookmarkStart w:colFirst="0" w:colLast="0" w:name="_gwvwdxzmujx" w:id="13"/>
+      <w:bookmarkStart w:colFirst="0" w:colLast="0" w:name="_zytnxmza2lb" w:id="13"/>
       <w:bookmarkEnd w:id="13"/>
       <w:r>
         <w:rPr>
@@ -4555,12 +4921,12 @@
           <wp:inline distB="114300" distT="114300" distL="114300" distR="114300">
             <wp:extent cx="5276533" cy="1685925"/>
             <wp:effectExtent b="0" l="0" r="0" t="0"/>
-            <wp:docPr id="12" name="image8.png"/>
+            <wp:docPr id="25" name="image16.png"/>
             <a:graphic>
               <a:graphicData uri="http://schemas.openxmlformats.org/drawingml/2006/picture">
                 <pic:pic>
                   <pic:nvPicPr>
-                    <pic:cNvPr id="0" name="image8.png"/>
+                    <pic:cNvPr id="0" name="image16.png"/>
                     <pic:cNvPicPr preferRelativeResize="0"/>
                   </pic:nvPicPr>
                   <pic:blipFill>
@@ -4615,12 +4981,12 @@
           <wp:inline distB="114300" distT="114300" distL="114300" distR="114300">
             <wp:extent cx="5476558" cy="2762250"/>
             <wp:effectExtent b="0" l="0" r="0" t="0"/>
-            <wp:docPr id="3" name="image3.png"/>
+            <wp:docPr id="26" name="image20.png"/>
             <a:graphic>
               <a:graphicData uri="http://schemas.openxmlformats.org/drawingml/2006/picture">
                 <pic:pic>
                   <pic:nvPicPr>
-                    <pic:cNvPr id="0" name="image3.png"/>
+                    <pic:cNvPr id="0" name="image20.png"/>
                     <pic:cNvPicPr preferRelativeResize="0"/>
                   </pic:nvPicPr>
                   <pic:blipFill>
@@ -4687,12 +5053,12 @@
           <wp:inline distB="114300" distT="114300" distL="114300" distR="114300">
             <wp:extent cx="5200333" cy="3095625"/>
             <wp:effectExtent b="0" l="0" r="0" t="0"/>
-            <wp:docPr id="1" name="image9.png"/>
+            <wp:docPr id="27" name="image21.png"/>
             <a:graphic>
               <a:graphicData uri="http://schemas.openxmlformats.org/drawingml/2006/picture">
                 <pic:pic>
                   <pic:nvPicPr>
-                    <pic:cNvPr id="0" name="image9.png"/>
+                    <pic:cNvPr id="0" name="image21.png"/>
                     <pic:cNvPicPr preferRelativeResize="0"/>
                   </pic:nvPicPr>
                   <pic:blipFill>
@@ -4755,12 +5121,12 @@
           <wp:inline distB="114300" distT="114300" distL="114300" distR="114300">
             <wp:extent cx="5781358" cy="1838325"/>
             <wp:effectExtent b="0" l="0" r="0" t="0"/>
-            <wp:docPr id="8" name="image13.png"/>
+            <wp:docPr id="29" name="image22.png"/>
             <a:graphic>
               <a:graphicData uri="http://schemas.openxmlformats.org/drawingml/2006/picture">
                 <pic:pic>
                   <pic:nvPicPr>
-                    <pic:cNvPr id="0" name="image13.png"/>
+                    <pic:cNvPr id="0" name="image22.png"/>
                     <pic:cNvPicPr preferRelativeResize="0"/>
                   </pic:nvPicPr>
                   <pic:blipFill>
@@ -4831,12 +5197,12 @@
           <wp:inline distB="114300" distT="114300" distL="114300" distR="114300">
             <wp:extent cx="5286058" cy="2247900"/>
             <wp:effectExtent b="0" l="0" r="0" t="0"/>
-            <wp:docPr id="14" name="image2.png"/>
+            <wp:docPr id="30" name="image23.png"/>
             <a:graphic>
               <a:graphicData uri="http://schemas.openxmlformats.org/drawingml/2006/picture">
                 <pic:pic>
                   <pic:nvPicPr>
-                    <pic:cNvPr id="0" name="image2.png"/>
+                    <pic:cNvPr id="0" name="image23.png"/>
                     <pic:cNvPicPr preferRelativeResize="0"/>
                   </pic:nvPicPr>
                   <pic:blipFill>
@@ -4897,12 +5263,12 @@
           <wp:inline distB="114300" distT="114300" distL="114300" distR="114300">
             <wp:extent cx="5287175" cy="2192243"/>
             <wp:effectExtent b="0" l="0" r="0" t="0"/>
-            <wp:docPr id="7" name="image21.png"/>
+            <wp:docPr id="4" name="image3.png"/>
             <a:graphic>
               <a:graphicData uri="http://schemas.openxmlformats.org/drawingml/2006/picture">
                 <pic:pic>
                   <pic:nvPicPr>
-                    <pic:cNvPr id="0" name="image21.png"/>
+                    <pic:cNvPr id="0" name="image3.png"/>
                     <pic:cNvPicPr preferRelativeResize="0"/>
                   </pic:nvPicPr>
                   <pic:blipFill>
@@ -4963,7 +5329,7 @@
           <wp:inline distB="114300" distT="114300" distL="114300" distR="114300">
             <wp:extent cx="5438458" cy="1962150"/>
             <wp:effectExtent b="0" l="0" r="0" t="0"/>
-            <wp:docPr id="21" name="image17.png"/>
+            <wp:docPr id="5" name="image17.png"/>
             <a:graphic>
               <a:graphicData uri="http://schemas.openxmlformats.org/drawingml/2006/picture">
                 <pic:pic>
@@ -5029,12 +5395,12 @@
           <wp:inline distB="114300" distT="114300" distL="114300" distR="114300">
             <wp:extent cx="5895658" cy="4381500"/>
             <wp:effectExtent b="0" l="0" r="0" t="0"/>
-            <wp:docPr id="6" name="image16.png"/>
+            <wp:docPr id="6" name="image10.png"/>
             <a:graphic>
               <a:graphicData uri="http://schemas.openxmlformats.org/drawingml/2006/picture">
                 <pic:pic>
                   <pic:nvPicPr>
-                    <pic:cNvPr id="0" name="image16.png"/>
+                    <pic:cNvPr id="0" name="image10.png"/>
                     <pic:cNvPicPr preferRelativeResize="0"/>
                   </pic:nvPicPr>
                   <pic:blipFill>
@@ -5097,6 +5463,447 @@
     </w:p>
     <w:p>
       <w:pPr>
+        <w:rPr/>
+      </w:pPr>
+      <w:r>
+        <w:rPr/>
+        <w:drawing>
+          <wp:inline distB="114300" distT="114300" distL="114300" distR="114300">
+            <wp:extent cx="5759140" cy="2857500"/>
+            <wp:effectExtent b="0" l="0" r="0" t="0"/>
+            <wp:docPr id="28" name="image29.png"/>
+            <a:graphic>
+              <a:graphicData uri="http://schemas.openxmlformats.org/drawingml/2006/picture">
+                <pic:pic>
+                  <pic:nvPicPr>
+                    <pic:cNvPr id="0" name="image29.png"/>
+                    <pic:cNvPicPr preferRelativeResize="0"/>
+                  </pic:nvPicPr>
+                  <pic:blipFill>
+                    <a:blip r:embed="rId31"/>
+                    <a:srcRect b="0" l="0" r="0" t="0"/>
+                    <a:stretch>
+                      <a:fillRect/>
+                    </a:stretch>
+                  </pic:blipFill>
+                  <pic:spPr>
+                    <a:xfrm>
+                      <a:off x="0" y="0"/>
+                      <a:ext cx="5759140" cy="2857500"/>
+                    </a:xfrm>
+                    <a:prstGeom prst="rect"/>
+                    <a:ln/>
+                  </pic:spPr>
+                </pic:pic>
+              </a:graphicData>
+            </a:graphic>
+          </wp:inline>
+        </w:drawing>
+      </w:r>
+      <w:r>
+        <w:rPr>
+          <w:rtl w:val="0"/>
+        </w:rPr>
+      </w:r>
+    </w:p>
+    <w:p>
+      <w:pPr>
+        <w:rPr/>
+      </w:pPr>
+      <w:r>
+        <w:rPr>
+          <w:rtl w:val="0"/>
+        </w:rPr>
+      </w:r>
+    </w:p>
+    <w:p>
+      <w:pPr>
+        <w:rPr/>
+      </w:pPr>
+      <w:r>
+        <w:rPr>
+          <w:rtl w:val="0"/>
+        </w:rPr>
+        <w:t xml:space="preserve">Figure 25.</w:t>
+      </w:r>
+    </w:p>
+    <w:p>
+      <w:pPr>
+        <w:rPr/>
+      </w:pPr>
+      <w:r>
+        <w:rPr/>
+        <w:drawing>
+          <wp:inline distB="114300" distT="114300" distL="114300" distR="114300">
+            <wp:extent cx="5759140" cy="2171700"/>
+            <wp:effectExtent b="0" l="0" r="0" t="0"/>
+            <wp:docPr id="2" name="image24.png"/>
+            <a:graphic>
+              <a:graphicData uri="http://schemas.openxmlformats.org/drawingml/2006/picture">
+                <pic:pic>
+                  <pic:nvPicPr>
+                    <pic:cNvPr id="0" name="image24.png"/>
+                    <pic:cNvPicPr preferRelativeResize="0"/>
+                  </pic:nvPicPr>
+                  <pic:blipFill>
+                    <a:blip r:embed="rId32"/>
+                    <a:srcRect b="0" l="0" r="0" t="0"/>
+                    <a:stretch>
+                      <a:fillRect/>
+                    </a:stretch>
+                  </pic:blipFill>
+                  <pic:spPr>
+                    <a:xfrm>
+                      <a:off x="0" y="0"/>
+                      <a:ext cx="5759140" cy="2171700"/>
+                    </a:xfrm>
+                    <a:prstGeom prst="rect"/>
+                    <a:ln/>
+                  </pic:spPr>
+                </pic:pic>
+              </a:graphicData>
+            </a:graphic>
+          </wp:inline>
+        </w:drawing>
+      </w:r>
+      <w:r>
+        <w:rPr>
+          <w:rtl w:val="0"/>
+        </w:rPr>
+      </w:r>
+    </w:p>
+    <w:p>
+      <w:pPr>
+        <w:rPr/>
+      </w:pPr>
+      <w:r>
+        <w:rPr>
+          <w:rtl w:val="0"/>
+        </w:rPr>
+        <w:t xml:space="preserve">Figure 26.</w:t>
+      </w:r>
+    </w:p>
+    <w:p>
+      <w:pPr>
+        <w:rPr/>
+      </w:pPr>
+      <w:r>
+        <w:rPr/>
+        <w:drawing>
+          <wp:inline distB="114300" distT="114300" distL="114300" distR="114300">
+            <wp:extent cx="5759140" cy="3009900"/>
+            <wp:effectExtent b="0" l="0" r="0" t="0"/>
+            <wp:docPr id="7" name="image25.png"/>
+            <a:graphic>
+              <a:graphicData uri="http://schemas.openxmlformats.org/drawingml/2006/picture">
+                <pic:pic>
+                  <pic:nvPicPr>
+                    <pic:cNvPr id="0" name="image25.png"/>
+                    <pic:cNvPicPr preferRelativeResize="0"/>
+                  </pic:nvPicPr>
+                  <pic:blipFill>
+                    <a:blip r:embed="rId33"/>
+                    <a:srcRect b="0" l="0" r="0" t="0"/>
+                    <a:stretch>
+                      <a:fillRect/>
+                    </a:stretch>
+                  </pic:blipFill>
+                  <pic:spPr>
+                    <a:xfrm>
+                      <a:off x="0" y="0"/>
+                      <a:ext cx="5759140" cy="3009900"/>
+                    </a:xfrm>
+                    <a:prstGeom prst="rect"/>
+                    <a:ln/>
+                  </pic:spPr>
+                </pic:pic>
+              </a:graphicData>
+            </a:graphic>
+          </wp:inline>
+        </w:drawing>
+      </w:r>
+      <w:r>
+        <w:rPr>
+          <w:rtl w:val="0"/>
+        </w:rPr>
+      </w:r>
+    </w:p>
+    <w:p>
+      <w:pPr>
+        <w:rPr/>
+      </w:pPr>
+      <w:r>
+        <w:rPr>
+          <w:rtl w:val="0"/>
+        </w:rPr>
+      </w:r>
+    </w:p>
+    <w:p>
+      <w:pPr>
+        <w:rPr/>
+      </w:pPr>
+      <w:r>
+        <w:rPr>
+          <w:rtl w:val="0"/>
+        </w:rPr>
+        <w:t xml:space="preserve">Figure 27.</w:t>
+      </w:r>
+    </w:p>
+    <w:p>
+      <w:pPr>
+        <w:rPr/>
+      </w:pPr>
+      <w:r>
+        <w:rPr/>
+        <w:drawing>
+          <wp:inline distB="114300" distT="114300" distL="114300" distR="114300">
+            <wp:extent cx="5759140" cy="4254500"/>
+            <wp:effectExtent b="0" l="0" r="0" t="0"/>
+            <wp:docPr id="3" name="image27.png"/>
+            <a:graphic>
+              <a:graphicData uri="http://schemas.openxmlformats.org/drawingml/2006/picture">
+                <pic:pic>
+                  <pic:nvPicPr>
+                    <pic:cNvPr id="0" name="image27.png"/>
+                    <pic:cNvPicPr preferRelativeResize="0"/>
+                  </pic:nvPicPr>
+                  <pic:blipFill>
+                    <a:blip r:embed="rId34"/>
+                    <a:srcRect b="0" l="0" r="0" t="0"/>
+                    <a:stretch>
+                      <a:fillRect/>
+                    </a:stretch>
+                  </pic:blipFill>
+                  <pic:spPr>
+                    <a:xfrm>
+                      <a:off x="0" y="0"/>
+                      <a:ext cx="5759140" cy="4254500"/>
+                    </a:xfrm>
+                    <a:prstGeom prst="rect"/>
+                    <a:ln/>
+                  </pic:spPr>
+                </pic:pic>
+              </a:graphicData>
+            </a:graphic>
+          </wp:inline>
+        </w:drawing>
+      </w:r>
+      <w:r>
+        <w:rPr>
+          <w:rtl w:val="0"/>
+        </w:rPr>
+      </w:r>
+    </w:p>
+    <w:p>
+      <w:pPr>
+        <w:rPr/>
+      </w:pPr>
+      <w:r>
+        <w:rPr>
+          <w:rtl w:val="0"/>
+        </w:rPr>
+      </w:r>
+    </w:p>
+    <w:p>
+      <w:pPr>
+        <w:rPr/>
+      </w:pPr>
+      <w:r>
+        <w:rPr>
+          <w:rtl w:val="0"/>
+        </w:rPr>
+        <w:t xml:space="preserve">Figure 28.</w:t>
+      </w:r>
+    </w:p>
+    <w:p>
+      <w:pPr>
+        <w:rPr/>
+      </w:pPr>
+      <w:r>
+        <w:rPr/>
+        <w:drawing>
+          <wp:inline distB="114300" distT="114300" distL="114300" distR="114300">
+            <wp:extent cx="5759140" cy="4813300"/>
+            <wp:effectExtent b="0" l="0" r="0" t="0"/>
+            <wp:docPr id="13" name="image30.png"/>
+            <a:graphic>
+              <a:graphicData uri="http://schemas.openxmlformats.org/drawingml/2006/picture">
+                <pic:pic>
+                  <pic:nvPicPr>
+                    <pic:cNvPr id="0" name="image30.png"/>
+                    <pic:cNvPicPr preferRelativeResize="0"/>
+                  </pic:nvPicPr>
+                  <pic:blipFill>
+                    <a:blip r:embed="rId35"/>
+                    <a:srcRect b="0" l="0" r="0" t="0"/>
+                    <a:stretch>
+                      <a:fillRect/>
+                    </a:stretch>
+                  </pic:blipFill>
+                  <pic:spPr>
+                    <a:xfrm>
+                      <a:off x="0" y="0"/>
+                      <a:ext cx="5759140" cy="4813300"/>
+                    </a:xfrm>
+                    <a:prstGeom prst="rect"/>
+                    <a:ln/>
+                  </pic:spPr>
+                </pic:pic>
+              </a:graphicData>
+            </a:graphic>
+          </wp:inline>
+        </w:drawing>
+      </w:r>
+      <w:r>
+        <w:rPr>
+          <w:rtl w:val="0"/>
+        </w:rPr>
+      </w:r>
+    </w:p>
+    <w:p>
+      <w:pPr>
+        <w:rPr/>
+      </w:pPr>
+      <w:r>
+        <w:rPr>
+          <w:rtl w:val="0"/>
+        </w:rPr>
+      </w:r>
+    </w:p>
+    <w:p>
+      <w:pPr>
+        <w:rPr/>
+      </w:pPr>
+      <w:r>
+        <w:rPr>
+          <w:rtl w:val="0"/>
+        </w:rPr>
+        <w:t xml:space="preserve">Figure 29.</w:t>
+      </w:r>
+    </w:p>
+    <w:p>
+      <w:pPr>
+        <w:rPr/>
+      </w:pPr>
+      <w:r>
+        <w:rPr/>
+        <w:drawing>
+          <wp:inline distB="114300" distT="114300" distL="114300" distR="114300">
+            <wp:extent cx="5759140" cy="4445000"/>
+            <wp:effectExtent b="0" l="0" r="0" t="0"/>
+            <wp:docPr id="8" name="image28.png"/>
+            <a:graphic>
+              <a:graphicData uri="http://schemas.openxmlformats.org/drawingml/2006/picture">
+                <pic:pic>
+                  <pic:nvPicPr>
+                    <pic:cNvPr id="0" name="image28.png"/>
+                    <pic:cNvPicPr preferRelativeResize="0"/>
+                  </pic:nvPicPr>
+                  <pic:blipFill>
+                    <a:blip r:embed="rId36"/>
+                    <a:srcRect b="0" l="0" r="0" t="0"/>
+                    <a:stretch>
+                      <a:fillRect/>
+                    </a:stretch>
+                  </pic:blipFill>
+                  <pic:spPr>
+                    <a:xfrm>
+                      <a:off x="0" y="0"/>
+                      <a:ext cx="5759140" cy="4445000"/>
+                    </a:xfrm>
+                    <a:prstGeom prst="rect"/>
+                    <a:ln/>
+                  </pic:spPr>
+                </pic:pic>
+              </a:graphicData>
+            </a:graphic>
+          </wp:inline>
+        </w:drawing>
+      </w:r>
+      <w:r>
+        <w:rPr>
+          <w:rtl w:val="0"/>
+        </w:rPr>
+      </w:r>
+    </w:p>
+    <w:p>
+      <w:pPr>
+        <w:rPr/>
+      </w:pPr>
+      <w:r>
+        <w:rPr>
+          <w:rtl w:val="0"/>
+        </w:rPr>
+      </w:r>
+    </w:p>
+    <w:p>
+      <w:pPr>
+        <w:rPr/>
+      </w:pPr>
+      <w:r>
+        <w:rPr>
+          <w:rtl w:val="0"/>
+        </w:rPr>
+        <w:t xml:space="preserve">Figure 30.</w:t>
+      </w:r>
+    </w:p>
+    <w:p>
+      <w:pPr>
+        <w:rPr/>
+      </w:pPr>
+      <w:r>
+        <w:rPr/>
+        <w:drawing>
+          <wp:inline distB="114300" distT="114300" distL="114300" distR="114300">
+            <wp:extent cx="5759140" cy="3479800"/>
+            <wp:effectExtent b="0" l="0" r="0" t="0"/>
+            <wp:docPr id="1" name="image26.png"/>
+            <a:graphic>
+              <a:graphicData uri="http://schemas.openxmlformats.org/drawingml/2006/picture">
+                <pic:pic>
+                  <pic:nvPicPr>
+                    <pic:cNvPr id="0" name="image26.png"/>
+                    <pic:cNvPicPr preferRelativeResize="0"/>
+                  </pic:nvPicPr>
+                  <pic:blipFill>
+                    <a:blip r:embed="rId37"/>
+                    <a:srcRect b="0" l="0" r="0" t="0"/>
+                    <a:stretch>
+                      <a:fillRect/>
+                    </a:stretch>
+                  </pic:blipFill>
+                  <pic:spPr>
+                    <a:xfrm>
+                      <a:off x="0" y="0"/>
+                      <a:ext cx="5759140" cy="3479800"/>
+                    </a:xfrm>
+                    <a:prstGeom prst="rect"/>
+                    <a:ln/>
+                  </pic:spPr>
+                </pic:pic>
+              </a:graphicData>
+            </a:graphic>
+          </wp:inline>
+        </w:drawing>
+      </w:r>
+      <w:r>
+        <w:rPr>
+          <w:rtl w:val="0"/>
+        </w:rPr>
+      </w:r>
+    </w:p>
+    <w:p>
+      <w:pPr>
+        <w:rPr/>
+      </w:pPr>
+      <w:r>
+        <w:rPr>
+          <w:rtl w:val="0"/>
+        </w:rPr>
+      </w:r>
+    </w:p>
+    <w:p>
+      <w:pPr>
         <w:pStyle w:val="Heading1"/>
         <w:rPr/>
       </w:pPr>
@@ -5228,7 +6035,7 @@
         <w:rPr>
           <w:rtl w:val="0"/>
         </w:rPr>
-        <w:t xml:space="preserve">SampleStudent (StudentID:xxxxxxxx) -</w:t>
+        <w:t xml:space="preserve">Muhammad Ammar (StudentID: 20250440) - Customers and Flights database combine analysis, Behavioral Segmentation</w:t>
       </w:r>
     </w:p>
     <w:p>
@@ -5306,7 +6113,6 @@
     <w:pPr>
       <w:keepNext w:val="0"/>
       <w:keepLines w:val="0"/>
-      <w:pageBreakBefore w:val="0"/>
       <w:widowControl w:val="1"/>
       <w:pBdr>
         <w:top w:space="0" w:sz="0" w:val="nil"/>
@@ -5370,7 +6176,6 @@
     <w:pPr>
       <w:keepNext w:val="0"/>
       <w:keepLines w:val="0"/>
-      <w:pageBreakBefore w:val="0"/>
       <w:widowControl w:val="1"/>
       <w:pBdr>
         <w:top w:space="0" w:sz="0" w:val="nil"/>
@@ -5477,7 +6282,7 @@
       <w:lvlText w:val="%1.%2.%3.%4.%5.%6."/>
       <w:lvlJc w:val="left"/>
       <w:pPr>
-        <w:ind w:left="2736" w:hanging="935.9999999999998"/>
+        <w:ind w:left="2736" w:hanging="935.9999999999995"/>
       </w:pPr>
       <w:rPr/>
     </w:lvl>

</xml_diff>